<commit_message>
feat(palestras): entrega o kit da Copel só em Word e Excel
Os participantes são usuários de negócio, e os arquivos .md e .csv do kit
exigiam conhecimento que eles não têm. As fontes .md e o .csv passam para
scripts/kit-copel/fontes/, fora da pasta publicada, e o kit fica apenas
com .docx e .xlsx: leia-me, propostas, benchmark, prompts, instruções e
roteiro do workflow, casos, registro, política, cartões de papel e
modelo de ata, além do guia do facilitador. Os nomes técnicos dão lugar a
nomes legíveis (workflow/instrucoes-das-skills.docx, prompts/
prompt-1-estruturado.docx), os prompts ficam em quadros cinza para cópia,
e slides, material e textos de instrução deixam de citar Bloco de Notas,
crases e pastas. O gerador build-kit.mjs lê das fontes e produz um .docx
para cada .md.

Co-Authored-By: Claude Opus 5.5 <noreply@anthropic.com>
Claude-Session: https://claude.ai/code/session_01LKavBbzuCsNGTvmY2ZGBcU
</commit_message>
<xml_diff>
--- a/pages/palestras/assets/copel/kit-ia-na-pratica/benchmark/relatorio-benchmark-ia-distribuicao.docx
+++ b/pages/palestras/assets/copel/kit-ia-na-pratica/benchmark/relatorio-benchmark-ia-distribuicao.docx
@@ -2,14 +2,6 @@
 <file path=word/document.xml><?xml version="1.0" encoding="utf-8"?>
 <w:document xmlns:w="http://schemas.openxmlformats.org/wordprocessingml/2006/main" xmlns:m="http://schemas.openxmlformats.org/officeDocument/2006/math" xmlns:r="http://schemas.openxmlformats.org/officeDocument/2006/relationships" xmlns:o="urn:schemas-microsoft-com:office:office" xmlns:v="urn:schemas-microsoft-com:vml" xmlns:w10="urn:schemas-microsoft-com:office:word" xmlns:a="http://schemas.openxmlformats.org/drawingml/2006/main" xmlns:pic="http://schemas.openxmlformats.org/drawingml/2006/picture" xmlns:wp="http://schemas.openxmlformats.org/drawingml/2006/wordprocessingDrawing">
   <w:body>
-    <w:p>
-      <w:pPr>
-        <w:pStyle w:val="Title"/>
-      </w:pPr>
-      <w:r>
-        <w:t xml:space="preserve">Benchmark de mercado</w:t>
-      </w:r>
-    </w:p>
     <w:bookmarkStart w:id="20" w:name="Xa8ec8ce7748da83163c43a9b40275c6ff48505e"/>
     <w:p>
       <w:pPr>
@@ -61,19 +53,7 @@
         <w:pStyle w:val="FirstParagraph"/>
       </w:pPr>
       <w:r>
-        <w:t xml:space="preserve">Este relatório compara cinco distribuidoras de porte médio e grande quanto a indicadores de continuidade, perdas e atendimento, e registra os casos de uso de inteligência artificial que cada uma tornou públicos. Os indicadores estão na planilha</w:t>
-      </w:r>
-      <w:r>
-        <w:t xml:space="preserve"> </w:t>
-      </w:r>
-      <w:r>
-        <w:rPr>
-          <w:rStyle w:val="VerbatimChar"/>
-        </w:rPr>
-        <w:t xml:space="preserve">indicadores-distribuidoras.csv</w:t>
-      </w:r>
-      <w:r>
-        <w:t xml:space="preserve">, que acompanha este documento. Os casos de uso foram levantados em relatórios anuais, artigos técnicos e comunicados à imprensa, e a fonte de cada um está indicada ao final da seção.</w:t>
+        <w:t xml:space="preserve">Este relatório compara cinco distribuidoras de porte médio e grande quanto a indicadores de continuidade, perdas e atendimento, e registra os casos de uso de inteligência artificial que cada uma tornou públicos. Os indicadores estão na planilha indicadores-distribuidoras.xlsx, que acompanha este documento. Os casos de uso foram levantados em relatórios anuais, artigos técnicos e comunicados à imprensa, e a fonte de cada um está indicada ao final da seção.</w:t>
       </w:r>
     </w:p>
     <w:bookmarkEnd w:id="9"/>
@@ -1770,7 +1750,17 @@
     <w:link w:val="VerbatimChar"/>
     <w:pPr>
       <w:wordWrap w:val="off"/>
-    </w:pPr>
+      <w:pBdr>
+        <w:top w:val="single" w:sz="4" w:space="6" w:color="A6A6A6"/>
+        <w:left w:val="single" w:sz="4" w:space="6" w:color="A6A6A6"/>
+        <w:bottom w:val="single" w:sz="4" w:space="6" w:color="A6A6A6"/>
+        <w:right w:val="single" w:sz="4" w:space="6" w:color="A6A6A6"/>
+      </w:pBdr>
+      <w:shd w:val="clear" w:color="auto" w:fill="EDEDED"/>
+    </w:pPr>
+    <w:rPr>
+      <w:sz w:val="20"/>
+    </w:rPr>
   </w:style>
   <w:style w:type="character" w:customStyle="1" w:styleId="KeywordTok">
     <w:name w:val="KeywordTok"/>

</xml_diff>